<commit_message>
Add Java and expand skills with support, IT, service, and soft skills
Add Java to Languages and four new skill groups (Technical Support,
IT/Systems, Public Service & Communication, Soft Skills) on both site
and resume.

Co-Authored-By: Claude Opus 4.8 <noreply@anthropic.com>
</commit_message>
<xml_diff>
--- a/resume/resume.docx
+++ b/resume/resume.docx
@@ -1514,7 +1514,7 @@
           <w:spacing w:val="0"/>
           <w:color w:val="111316"/>
         </w:rPr>
-        <w:t xml:space="preserve"> Python, TypeScript, JavaScript, SQL, HTML &amp; CSS</w:t>
+        <w:t xml:space="preserve"> Python, TypeScript, JavaScript, Java, SQL, HTML &amp; CSS</w:t>
       </w:r>
     </w:p>
     <w:p>
@@ -1600,17 +1600,89 @@
           <w:spacing w:val="0"/>
           <w:color w:val="111316"/>
         </w:rPr>
-        <w:t xml:space="preserve">Professional:</w:t>
-      </w:r>
-      <w:r>
-        <w:rPr>
-          <w:rFonts w:ascii="Helvetica Neue" w:hAnsi="Helvetica Neue" w:cs="Helvetica Neue"/>
-          <w:sz w:val="28"/>
-          <w:sz-cs w:val="28"/>
-          <w:spacing w:val="0"/>
-          <w:color w:val="111316"/>
-        </w:rPr>
-        <w:t xml:space="preserve"> Project management, Stakeholder communication, Technical documentation, Cross-functional collaboration, Public service, CJIS clearance</w:t>
+        <w:t xml:space="preserve">Technical Support:</w:t>
+      </w:r>
+      <w:r>
+        <w:rPr>
+          <w:rFonts w:ascii="Helvetica Neue" w:hAnsi="Helvetica Neue" w:cs="Helvetica Neue"/>
+          <w:sz w:val="28"/>
+          <w:sz-cs w:val="28"/>
+          <w:spacing w:val="0"/>
+          <w:color w:val="111316"/>
+        </w:rPr>
+        <w:t xml:space="preserve"> End-user Support, Hardware &amp; Software Troubleshooting, PC Diagnostics, System Maintenance, Hardware &amp; Software Installation, LAN Support, Network Troubleshooting, Ticketing Systems, Remote Troubleshooting, System Monitoring, Inventory Management</w:t>
+      </w:r>
+    </w:p>
+    <w:p>
+      <w:pPr/>
+      <w:r>
+        <w:rPr>
+          <w:rFonts w:ascii="Helvetica Neue" w:hAnsi="Helvetica Neue" w:cs="Helvetica Neue"/>
+          <w:sz w:val="28"/>
+          <w:sz-cs w:val="28"/>
+          <w:b/>
+          <w:spacing w:val="0"/>
+          <w:color w:val="111316"/>
+        </w:rPr>
+        <w:t xml:space="preserve">IT / Systems:</w:t>
+      </w:r>
+      <w:r>
+        <w:rPr>
+          <w:rFonts w:ascii="Helvetica Neue" w:hAnsi="Helvetica Neue" w:cs="Helvetica Neue"/>
+          <w:sz w:val="28"/>
+          <w:sz-cs w:val="28"/>
+          <w:spacing w:val="0"/>
+          <w:color w:val="111316"/>
+        </w:rPr>
+        <w:t xml:space="preserve"> AWS Cloud Systems, System Logs &amp; Metrics, Data Integrity, Access / Security Awareness, Process Improvement, Workflow Optimization, Agile Workflows</w:t>
+      </w:r>
+    </w:p>
+    <w:p>
+      <w:pPr/>
+      <w:r>
+        <w:rPr>
+          <w:rFonts w:ascii="Helvetica Neue" w:hAnsi="Helvetica Neue" w:cs="Helvetica Neue"/>
+          <w:sz w:val="28"/>
+          <w:sz-cs w:val="28"/>
+          <w:b/>
+          <w:spacing w:val="0"/>
+          <w:color w:val="111316"/>
+        </w:rPr>
+        <w:t xml:space="preserve">Public Service &amp; Communication:</w:t>
+      </w:r>
+      <w:r>
+        <w:rPr>
+          <w:rFonts w:ascii="Helvetica Neue" w:hAnsi="Helvetica Neue" w:cs="Helvetica Neue"/>
+          <w:sz w:val="28"/>
+          <w:sz-cs w:val="28"/>
+          <w:spacing w:val="0"/>
+          <w:color w:val="111316"/>
+        </w:rPr>
+        <w:t xml:space="preserve"> Customer Service, Public-sector Operations, Cross-functional Collaboration, Clear Technical Communication, Field Operations Support, Effective Working Relationships, Documentation &amp; Reporting, CJIS Clearance</w:t>
+      </w:r>
+    </w:p>
+    <w:p>
+      <w:pPr/>
+      <w:r>
+        <w:rPr>
+          <w:rFonts w:ascii="Helvetica Neue" w:hAnsi="Helvetica Neue" w:cs="Helvetica Neue"/>
+          <w:sz w:val="28"/>
+          <w:sz-cs w:val="28"/>
+          <w:b/>
+          <w:spacing w:val="0"/>
+          <w:color w:val="111316"/>
+        </w:rPr>
+        <w:t xml:space="preserve">Soft Skills:</w:t>
+      </w:r>
+      <w:r>
+        <w:rPr>
+          <w:rFonts w:ascii="Helvetica Neue" w:hAnsi="Helvetica Neue" w:cs="Helvetica Neue"/>
+          <w:sz w:val="28"/>
+          <w:sz-cs w:val="28"/>
+          <w:spacing w:val="0"/>
+          <w:color w:val="111316"/>
+        </w:rPr>
+        <w:t xml:space="preserve"> Team Collaboration, Problem Solving, Innovation, Communication, Deliver Results, Earn Trust, Building Camaraderie, Agile Methodologies</w:t>
       </w:r>
     </w:p>
     <w:p>

</xml_diff>